<commit_message>
feat: add lot search functionality and update label numbers in templates
</commit_message>
<xml_diff>
--- a/templates/label_cmm.docx
+++ b/templates/label_cmm.docx
@@ -315,7 +315,7 @@
                 <w:sz w:val="16"/>
                 <w:szCs w:val="16"/>
               </w:rPr>
-              <w:t>2</w:t>
+              <w:t>11</w:t>
             </w:r>
             <w:r>
               <w:rPr>
@@ -543,7 +543,7 @@
                 <w:sz w:val="16"/>
                 <w:szCs w:val="16"/>
               </w:rPr>
-              <w:t>3</w:t>
+              <w:t>21</w:t>
             </w:r>
             <w:r>
               <w:rPr>
@@ -834,7 +834,7 @@
                 <w:sz w:val="16"/>
                 <w:szCs w:val="16"/>
               </w:rPr>
-              <w:t>4</w:t>
+              <w:t>2</w:t>
             </w:r>
             <w:r>
               <w:rPr>
@@ -1063,7 +1063,7 @@
                 <w:sz w:val="16"/>
                 <w:szCs w:val="16"/>
               </w:rPr>
-              <w:t>5</w:t>
+              <w:t>12</w:t>
             </w:r>
             <w:r>
               <w:rPr>
@@ -1291,7 +1291,7 @@
                 <w:sz w:val="16"/>
                 <w:szCs w:val="16"/>
               </w:rPr>
-              <w:t>6</w:t>
+              <w:t>22</w:t>
             </w:r>
             <w:r>
               <w:rPr>
@@ -1502,7 +1502,7 @@
                 <w:sz w:val="16"/>
                 <w:szCs w:val="16"/>
               </w:rPr>
-              <w:t>7</w:t>
+              <w:t>3</w:t>
             </w:r>
             <w:r>
               <w:rPr>
@@ -1731,7 +1731,7 @@
                 <w:sz w:val="16"/>
                 <w:szCs w:val="16"/>
               </w:rPr>
-              <w:t>8</w:t>
+              <w:t>13</w:t>
             </w:r>
             <w:r>
               <w:rPr>
@@ -1959,7 +1959,7 @@
                 <w:sz w:val="16"/>
                 <w:szCs w:val="16"/>
               </w:rPr>
-              <w:t>9</w:t>
+              <w:t>23</w:t>
             </w:r>
             <w:r>
               <w:rPr>
@@ -2170,7 +2170,7 @@
                 <w:sz w:val="16"/>
                 <w:szCs w:val="16"/>
               </w:rPr>
-              <w:t>10</w:t>
+              <w:t>4</w:t>
             </w:r>
             <w:r>
               <w:rPr>
@@ -2399,7 +2399,7 @@
                 <w:sz w:val="16"/>
                 <w:szCs w:val="16"/>
               </w:rPr>
-              <w:t>11</w:t>
+              <w:t>14</w:t>
             </w:r>
             <w:r>
               <w:rPr>
@@ -2630,7 +2630,7 @@
                 <w:sz w:val="16"/>
                 <w:szCs w:val="16"/>
               </w:rPr>
-              <w:t>12</w:t>
+              <w:t>24</w:t>
             </w:r>
             <w:r>
               <w:rPr>
@@ -2841,7 +2841,7 @@
                 <w:sz w:val="16"/>
                 <w:szCs w:val="16"/>
               </w:rPr>
-              <w:t>13</w:t>
+              <w:t>5</w:t>
             </w:r>
             <w:r>
               <w:rPr>
@@ -3069,7 +3069,7 @@
                 <w:sz w:val="16"/>
                 <w:szCs w:val="16"/>
               </w:rPr>
-              <w:t>14</w:t>
+              <w:t>15</w:t>
             </w:r>
             <w:r>
               <w:rPr>
@@ -3297,7 +3297,7 @@
                 <w:sz w:val="16"/>
                 <w:szCs w:val="16"/>
               </w:rPr>
-              <w:t>15</w:t>
+              <w:t>25</w:t>
             </w:r>
             <w:r>
               <w:rPr>
@@ -3508,7 +3508,7 @@
                 <w:sz w:val="16"/>
                 <w:szCs w:val="16"/>
               </w:rPr>
-              <w:t>16</w:t>
+              <w:t>6</w:t>
             </w:r>
             <w:r>
               <w:rPr>
@@ -3736,7 +3736,7 @@
                 <w:sz w:val="16"/>
                 <w:szCs w:val="16"/>
               </w:rPr>
-              <w:t>17</w:t>
+              <w:t>16</w:t>
             </w:r>
             <w:r>
               <w:rPr>
@@ -3964,7 +3964,7 @@
                 <w:sz w:val="16"/>
                 <w:szCs w:val="16"/>
               </w:rPr>
-              <w:t>18</w:t>
+              <w:t>26</w:t>
             </w:r>
             <w:r>
               <w:rPr>
@@ -4175,7 +4175,7 @@
                 <w:sz w:val="16"/>
                 <w:szCs w:val="16"/>
               </w:rPr>
-              <w:t>19</w:t>
+              <w:t>7</w:t>
             </w:r>
             <w:r>
               <w:rPr>
@@ -4403,7 +4403,7 @@
                 <w:sz w:val="16"/>
                 <w:szCs w:val="16"/>
               </w:rPr>
-              <w:t>20</w:t>
+              <w:t>17</w:t>
             </w:r>
             <w:r>
               <w:rPr>
@@ -4631,7 +4631,7 @@
                 <w:sz w:val="16"/>
                 <w:szCs w:val="16"/>
               </w:rPr>
-              <w:t>21</w:t>
+              <w:t>27</w:t>
             </w:r>
             <w:r>
               <w:rPr>
@@ -4842,7 +4842,7 @@
                 <w:sz w:val="16"/>
                 <w:szCs w:val="16"/>
               </w:rPr>
-              <w:t>22</w:t>
+              <w:t>8</w:t>
             </w:r>
             <w:r>
               <w:rPr>
@@ -5070,7 +5070,7 @@
                 <w:sz w:val="16"/>
                 <w:szCs w:val="16"/>
               </w:rPr>
-              <w:t>23</w:t>
+              <w:t>18</w:t>
             </w:r>
             <w:r>
               <w:rPr>
@@ -5298,7 +5298,7 @@
                 <w:sz w:val="16"/>
                 <w:szCs w:val="16"/>
               </w:rPr>
-              <w:t>24</w:t>
+              <w:t>28</w:t>
             </w:r>
             <w:r>
               <w:rPr>
@@ -5509,7 +5509,7 @@
                 <w:sz w:val="16"/>
                 <w:szCs w:val="16"/>
               </w:rPr>
-              <w:t>25</w:t>
+              <w:t>9</w:t>
             </w:r>
             <w:r>
               <w:rPr>
@@ -5737,7 +5737,7 @@
                 <w:sz w:val="16"/>
                 <w:szCs w:val="16"/>
               </w:rPr>
-              <w:t>26</w:t>
+              <w:t>19</w:t>
             </w:r>
             <w:r>
               <w:rPr>
@@ -5965,7 +5965,7 @@
                 <w:sz w:val="16"/>
                 <w:szCs w:val="16"/>
               </w:rPr>
-              <w:t>27</w:t>
+              <w:t>29</w:t>
             </w:r>
             <w:r>
               <w:rPr>
@@ -6176,7 +6176,7 @@
                 <w:sz w:val="16"/>
                 <w:szCs w:val="16"/>
               </w:rPr>
-              <w:t>28</w:t>
+              <w:t>10</w:t>
             </w:r>
             <w:r>
               <w:rPr>
@@ -6404,7 +6404,7 @@
                 <w:sz w:val="16"/>
                 <w:szCs w:val="16"/>
               </w:rPr>
-              <w:t>29</w:t>
+              <w:t>20</w:t>
             </w:r>
             <w:r>
               <w:rPr>

</xml_diff>